<commit_message>
Atualização da apostila (finalização da introdução). Falta fazer tabela comparativa tecnologias de eletrólise.
</commit_message>
<xml_diff>
--- a/docx/versao_word.docx
+++ b/docx/versao_word.docx
@@ -120,6 +120,821 @@
         <w:jc w:val="both"/>
       </w:pPr>
       <w:r>
+        <w:t>Pode-se observar, portanto, que a</w:t>
+      </w:r>
+      <w:r>
+        <w:t xml:space="preserve"> discussão acerca da confiabilidade do sistema elétrico conduz naturalmente ao tema do armazenamento de energia, elemento fundamental para viabilizar a elevada participação de fontes renováveis variáveis</w:t>
+      </w:r>
+      <w:r>
+        <w:t xml:space="preserve"> a partir do uso do hidrogênio</w:t>
+      </w:r>
+      <w:r>
+        <w:t xml:space="preserve">. </w:t>
+      </w:r>
+    </w:p>
+    <w:p>
+      <w:pPr>
+        <w:jc w:val="both"/>
+      </w:pPr>
+      <w:r>
+        <w:t>Atualmente, diferentes tecnologias encontram-se disponíveis para a realização dessa função</w:t>
+      </w:r>
+      <w:r>
+        <w:t xml:space="preserve"> de armazenamento</w:t>
+      </w:r>
+      <w:r>
+        <w:t xml:space="preserve">. Tais tecnologias podem ser classificadas conforme a forma de energia armazenada ou segundo a duração da descarga. Sob </w:t>
+      </w:r>
+      <w:r>
+        <w:lastRenderedPageBreak/>
+        <w:t>a ótica da forma de armazenamento, destacam-se alternativas mecânicas, eletroquímicas, químicas, elétricas e térmicas. Já sob a perspectiva temporal, distinguem-se sistemas de resposta de curto prazo, médio prazo e longo prazo, podendo estes últimos abranger períodos que variam de horas a dias ou até meses [@bhandari_2021].</w:t>
+      </w:r>
+    </w:p>
+    <w:p>
+      <w:pPr>
+        <w:jc w:val="both"/>
+      </w:pPr>
+      <w:r>
+        <w:t xml:space="preserve">Nesse cenário, o hidrogênio tem recebido atenção crescente como alternativa estratégica. Enquanto vetor energético, possibilita o transporte da energia e sua posterior conversão na forma mais adequada ao uso final. O excedente de geração proveniente de fontes como solar e eólica pode ser convertido em hidrogênio por meio da eletrólise da água, conceito frequentemente denominado </w:t>
+      </w:r>
+      <w:proofErr w:type="spellStart"/>
+      <w:r>
+        <w:rPr>
+          <w:i/>
+          <w:iCs/>
+        </w:rPr>
+        <w:t>power</w:t>
+      </w:r>
+      <w:proofErr w:type="spellEnd"/>
+      <w:r>
+        <w:rPr>
+          <w:i/>
+          <w:iCs/>
+        </w:rPr>
+        <w:t>-</w:t>
+      </w:r>
+      <w:proofErr w:type="spellStart"/>
+      <w:r>
+        <w:rPr>
+          <w:i/>
+          <w:iCs/>
+        </w:rPr>
+        <w:t>to-x</w:t>
+      </w:r>
+      <w:proofErr w:type="spellEnd"/>
+      <w:r>
+        <w:t>. Essa característica viabiliza o armazenamento por longos períodos, inclusive em bases sazonais, além de permitir o transporte em grandes distâncias</w:t>
+      </w:r>
+      <w:r>
+        <w:t xml:space="preserve">, </w:t>
+      </w:r>
+      <w:r>
+        <w:t>conectando segmentos consumidores e produtores de energia em um processo conhecido como acoplamento setorial [@bhandari_2021].</w:t>
+      </w:r>
+    </w:p>
+    <w:p>
+      <w:pPr>
+        <w:jc w:val="both"/>
+      </w:pPr>
+      <w:r>
+        <w:t>A literatura também distingue soluções de armazenamento de curto e de longo prazo. Enquanto as baterias representam exemplos típicos de respostas rápidas, os sistemas baseados em hidrogênio caracterizam-se pela capacidade de compensar variações na geração ao longo de períodos extensos, que podem atingir meses ou anos, inclusive para fins de balanceamento sazonal. Em comparação às tecnologias de curto prazo, apresentam maior volume de armazenamento, embora com menor eficiência de ciclo. Entretanto, em aplicações que demandam grandes capacidades energéticas, o menor custo relativo associado à energia armazenada torna essas soluções mais atrativas, sendo o armazenamento químico na forma de hidrogênio apontado como alternativa promissora [@bhandari_2021].</w:t>
+      </w:r>
+    </w:p>
+    <w:p>
+      <w:pPr>
+        <w:jc w:val="both"/>
+      </w:pPr>
+      <w:r>
+        <w:t xml:space="preserve">Além disso, o hidrogênio demonstra competitividade frente a outras tecnologias no que se refere à confiabilidade e ao armazenamento em larga escala, permitindo que a eletricidade renovável produzida de forma dispersa seja aproveitada em usos finais situados em diferentes localidades, sob uma perspectiva global [@gallardo_2021]. Ainda que as baterias desempenhem papel relevante, sua aplicação tende a ser mais onerosa e menos eficiente para horizontes prolongados. </w:t>
+      </w:r>
+    </w:p>
+    <w:p>
+      <w:pPr>
+        <w:jc w:val="both"/>
+      </w:pPr>
+      <w:r>
+        <w:t>Nesse contexto, o hidrogênio</w:t>
+      </w:r>
+      <w:r>
+        <w:t xml:space="preserve"> </w:t>
+      </w:r>
+      <w:r>
+        <w:t xml:space="preserve">apresenta-se como solução estratégica tanto para armazenamento quanto para consumo de energia, contribuindo para mitigar a volatilidade das fontes renováveis. Como variante das tecnologias </w:t>
+      </w:r>
+      <w:proofErr w:type="spellStart"/>
+      <w:r>
+        <w:rPr>
+          <w:i/>
+          <w:iCs/>
+        </w:rPr>
+        <w:t>power-to-gas</w:t>
+      </w:r>
+      <w:proofErr w:type="spellEnd"/>
+      <w:r>
+        <w:t>, oferece uma via promissora para armazenamento e conversão de longo prazo, podendo constituir alternativa economicamente viável às baterias, além de apresentar zero emissões de carbono e maior densidade de armazenamento de energia [@park_2024].</w:t>
+      </w:r>
+    </w:p>
+    <w:p>
+      <w:pPr>
+        <w:jc w:val="both"/>
+      </w:pPr>
+      <w:r>
+        <w:t xml:space="preserve">A possibilidade de armazenamento em larga escala conduz, inevitavelmente, à discussão sobre transporte e comércio internacional. A cadeia de suprimentos do </w:t>
+      </w:r>
+      <w:r>
+        <w:lastRenderedPageBreak/>
+        <w:t>hidrogênio envolve desafios técnicos relevantes. O hidrogênio liquefeito apresenta densidade de massa significativamente superior à do hidrogênio gasoso comprimido; contudo, suas condições logísticas são consideravelmente mais exigentes. Alternativamente, vetores químicos como a amônia podem mostrar-se adequados para transporte de longa distância, em virtude da maior densidade e da estabilidade em condições operacionais mais brandas [@gallardo_2021].</w:t>
+      </w:r>
+    </w:p>
+    <w:p>
+      <w:pPr>
+        <w:jc w:val="both"/>
+      </w:pPr>
+      <w:r>
+        <w:t xml:space="preserve">A relevância desse debate torna-se evidente diante das projeções de demanda. </w:t>
+      </w:r>
+      <w:r>
+        <w:t xml:space="preserve">Projeções internacionais indicam que a produção global de hidrogênio poderá atingir aproximadamente </w:t>
+      </w:r>
+      <w:r>
+        <w:rPr>
+          <w:b/>
+          <w:bCs/>
+        </w:rPr>
+        <w:t>70 EJ em 2050</w:t>
+      </w:r>
+      <w:r>
+        <w:t xml:space="preserve">, dos quais cerca de </w:t>
+      </w:r>
+      <w:r>
+        <w:rPr>
+          <w:b/>
+          <w:bCs/>
+        </w:rPr>
+        <w:t>50 EJ</w:t>
+      </w:r>
+      <w:r>
+        <w:t xml:space="preserve"> seriam provenientes de eletricidade renovável [@correa_2022]. O Conselho do Hidrogênio sugere que a demanda mundial poderá crescer até </w:t>
+      </w:r>
+      <w:r>
+        <w:rPr>
+          <w:b/>
+          <w:bCs/>
+        </w:rPr>
+        <w:t>dez vezes</w:t>
+      </w:r>
+      <w:r>
+        <w:t xml:space="preserve"> nesse horizonte, aproximando-se de </w:t>
+      </w:r>
+      <w:r>
+        <w:rPr>
+          <w:b/>
+          <w:bCs/>
+        </w:rPr>
+        <w:t>80 EJ</w:t>
+      </w:r>
+      <w:r>
+        <w:t xml:space="preserve">. Entretanto, diversas economias deverão enfrentar limitações relevantes quanto à disponibilidade de recursos renováveis. Países asiáticos como </w:t>
+      </w:r>
+      <w:r>
+        <w:rPr>
+          <w:b/>
+          <w:bCs/>
+        </w:rPr>
+        <w:t>China, Japão e Coreia do Sul</w:t>
+      </w:r>
+      <w:r>
+        <w:t xml:space="preserve">, bem como grande parte da </w:t>
+      </w:r>
+      <w:r>
+        <w:rPr>
+          <w:b/>
+          <w:bCs/>
+        </w:rPr>
+        <w:t>Europa</w:t>
+      </w:r>
+      <w:r>
+        <w:t xml:space="preserve">, tendem a depender de importações para satisfazer suas necessidades energéticas. No caso europeu, reforça-se a expectativa de consumo em torno de </w:t>
+      </w:r>
+      <w:r>
+        <w:rPr>
+          <w:b/>
+          <w:bCs/>
+        </w:rPr>
+        <w:t xml:space="preserve">2250 </w:t>
+      </w:r>
+      <w:proofErr w:type="spellStart"/>
+      <w:r>
+        <w:rPr>
+          <w:b/>
+          <w:bCs/>
+        </w:rPr>
+        <w:t>TWh</w:t>
+      </w:r>
+      <w:proofErr w:type="spellEnd"/>
+      <w:r>
+        <w:rPr>
+          <w:b/>
+          <w:bCs/>
+        </w:rPr>
+        <w:t>/ano (8,1 EJ/ano)</w:t>
+      </w:r>
+      <w:r>
+        <w:t xml:space="preserve">, com a necessidade de importar pelo menos </w:t>
+      </w:r>
+      <w:r>
+        <w:rPr>
+          <w:b/>
+          <w:bCs/>
+        </w:rPr>
+        <w:t xml:space="preserve">1000 </w:t>
+      </w:r>
+      <w:proofErr w:type="spellStart"/>
+      <w:r>
+        <w:rPr>
+          <w:b/>
+          <w:bCs/>
+        </w:rPr>
+        <w:t>TWh</w:t>
+      </w:r>
+      <w:proofErr w:type="spellEnd"/>
+      <w:r>
+        <w:rPr>
+          <w:b/>
+          <w:bCs/>
+        </w:rPr>
+        <w:t>/ano (3,6 EJ/ano)</w:t>
+      </w:r>
+      <w:r>
+        <w:t xml:space="preserve"> [@correa_2022]. Nesse ambiente, análises técnico-econômicas projetam a </w:t>
+      </w:r>
+      <w:r>
+        <w:rPr>
+          <w:b/>
+          <w:bCs/>
+        </w:rPr>
+        <w:t>América do Norte</w:t>
+      </w:r>
+      <w:r>
+        <w:t xml:space="preserve"> como potencial maior exportador até 2030, seguida pela </w:t>
+      </w:r>
+      <w:r>
+        <w:rPr>
+          <w:b/>
+          <w:bCs/>
+        </w:rPr>
+        <w:t>Austrália</w:t>
+      </w:r>
+      <w:r>
+        <w:t xml:space="preserve">, e indicam que cerca de </w:t>
+      </w:r>
+      <w:r>
+        <w:rPr>
+          <w:b/>
+          <w:bCs/>
+        </w:rPr>
+        <w:t>85% da demanda global estimada em 300 milhões de toneladas de hidrogênio verde até 2050</w:t>
+      </w:r>
+      <w:r>
+        <w:t xml:space="preserve"> poderá requerer transporte inter-regional para atingir uma alocação economicamente eficiente [@park_2024].</w:t>
+      </w:r>
+    </w:p>
+    <w:p>
+      <w:pPr>
+        <w:jc w:val="both"/>
+      </w:pPr>
+      <w:r>
+        <w:t>A partir desse</w:t>
+      </w:r>
+      <w:r>
+        <w:t xml:space="preserve"> crescimento expressivo do mercado internacional</w:t>
+      </w:r>
+      <w:r>
+        <w:t xml:space="preserve"> espera-se significativa </w:t>
+      </w:r>
+      <w:r>
+        <w:t xml:space="preserve">ampliação da produção </w:t>
+      </w:r>
+      <w:r>
+        <w:t>em um contexto em que</w:t>
+      </w:r>
+      <w:r>
+        <w:t xml:space="preserve"> novas rotas comerciais tenderão a conectar produtores de baixo custo a grandes centros consumidores, sendo frequentemente citadas regiões do Norte da África e da América do Sul como áreas estratégicas para exportação</w:t>
+      </w:r>
+      <w:r>
+        <w:t xml:space="preserve"> </w:t>
+      </w:r>
+      <w:r>
+        <w:t>[@correa_2022]</w:t>
+      </w:r>
+      <w:r>
+        <w:t>. Tais localidades configuram, portanto, potenciais concorrentes do Brasil no mercado internacional de hidrogênio</w:t>
+      </w:r>
+      <w:r>
+        <w:t>.</w:t>
+      </w:r>
+    </w:p>
+    <w:p>
+      <w:pPr>
+        <w:jc w:val="both"/>
+      </w:pPr>
+    </w:p>
+    <w:p>
+      <w:pPr>
+        <w:jc w:val="both"/>
+      </w:pPr>
+      <w:r>
+        <w:t>###############</w:t>
+      </w:r>
+    </w:p>
+    <w:p>
+      <w:pPr>
+        <w:jc w:val="both"/>
+        <w:rPr>
+          <w:color w:val="EE0000"/>
+        </w:rPr>
+      </w:pPr>
+      <w:r>
+        <w:rPr>
+          <w:color w:val="EE0000"/>
+        </w:rPr>
+        <w:t xml:space="preserve">Apesar da reconhecida sinergia entre a expansão das fontes renováveis, a necessidade de armazenamento e o papel estratégico do hidrogênio como vetor energético, a rota de eletrólise ainda representa parcela minoritária da produção mundial. </w:t>
+      </w:r>
+    </w:p>
+    <w:p>
+      <w:pPr>
+        <w:jc w:val="both"/>
+        <w:rPr>
+          <w:color w:val="EE0000"/>
+        </w:rPr>
+      </w:pPr>
+      <w:r>
+        <w:rPr>
+          <w:color w:val="EE0000"/>
+        </w:rPr>
+        <w:t>Como se sabe,</w:t>
+      </w:r>
+      <w:r>
+        <w:rPr>
+          <w:color w:val="EE0000"/>
+        </w:rPr>
+        <w:t xml:space="preserve"> o hidrogênio pode ser obtido por uma ampla variedade de processos, </w:t>
+      </w:r>
+      <w:r>
+        <w:rPr>
+          <w:color w:val="EE0000"/>
+        </w:rPr>
+        <w:t xml:space="preserve">envolvendo </w:t>
+      </w:r>
+      <w:r>
+        <w:rPr>
+          <w:color w:val="EE0000"/>
+        </w:rPr>
+        <w:t xml:space="preserve">tecnologias eletrolíticas, </w:t>
+      </w:r>
+      <w:proofErr w:type="spellStart"/>
+      <w:r>
+        <w:rPr>
+          <w:color w:val="EE0000"/>
+        </w:rPr>
+        <w:t>fotolíticas</w:t>
+      </w:r>
+      <w:proofErr w:type="spellEnd"/>
+      <w:r>
+        <w:rPr>
+          <w:color w:val="EE0000"/>
+        </w:rPr>
+        <w:t>, químicas, biológicas ou termoquímicas</w:t>
+      </w:r>
+      <w:r>
+        <w:rPr>
+          <w:color w:val="EE0000"/>
+        </w:rPr>
+        <w:t xml:space="preserve">, mas </w:t>
+      </w:r>
+      <w:r>
+        <w:t xml:space="preserve">a eletrólise destaca-se como o método conceitualmente </w:t>
+      </w:r>
+      <w:r>
+        <w:lastRenderedPageBreak/>
+        <w:t>mais simples e limpo</w:t>
+      </w:r>
+      <w:r>
+        <w:t xml:space="preserve"> </w:t>
+      </w:r>
+      <w:r>
+        <w:t>[@hurtubia_2021]. A aplicação de corrente elétrica promove a divisão da molécula de água em hidrogênio e oxigênio e, na etapa de uso final, a oxidação do hidrogênio em processos de combustão ou em células a combustível resulta novamente em água, configurando um ciclo que não envolve diretamente emissões de CO₂. Quando a eletricidade empregada é proveniente de fontes renováveis, o produto obtido caracteriza-se como hidrogênio verde [@rezaei_2022]. A intensidade de emissões associada à eletrólise, portanto, está intrinsecamente relacionada ao grau de descarbonização da matriz elétrica que alimenta o processo [@hurtubia_2021].</w:t>
+      </w:r>
+    </w:p>
+    <w:p>
+      <w:pPr>
+        <w:jc w:val="both"/>
+      </w:pPr>
+      <w:r>
+        <w:t>Porém, atualmente, a maior parte do hidrogênio produzido provém de rotas que utilizam combustíveis fósseis tais como reforma a vapor de gás natural e gaseificação de carvão que estão</w:t>
+      </w:r>
+      <w:r>
+        <w:t xml:space="preserve"> associad</w:t>
+      </w:r>
+      <w:r>
+        <w:t>a</w:t>
+      </w:r>
+      <w:r>
+        <w:t>s a emissões significativas de gases de efeito estufa</w:t>
+      </w:r>
+      <w:r>
+        <w:t xml:space="preserve"> mesmo que, em determinados contextos, </w:t>
+      </w:r>
+      <w:r>
+        <w:t>tecnologias de Captura</w:t>
+      </w:r>
+      <w:r>
+        <w:t xml:space="preserve"> </w:t>
+      </w:r>
+      <w:r>
+        <w:t xml:space="preserve">e Armazenamento de Carbono </w:t>
+      </w:r>
+      <w:r>
+        <w:t>sejam</w:t>
+      </w:r>
+      <w:r>
+        <w:t xml:space="preserve"> incorporadas para mitigar parte dessas emissões [@hurtubia_2021].</w:t>
+      </w:r>
+    </w:p>
+    <w:p>
+      <w:pPr>
+        <w:jc w:val="both"/>
+        <w:rPr>
+          <w:color w:val="EE0000"/>
+        </w:rPr>
+      </w:pPr>
+      <w:r>
+        <w:t xml:space="preserve">Ainda que a captura e o sequestro de carbono associados às rotas fósseis sejam tecnicamente viáveis, há evidências de que, em determinadas circunstâncias, as emissões totais </w:t>
+      </w:r>
+      <w:r>
+        <w:t xml:space="preserve">da produção do hidrogênio a partir destas rotas, </w:t>
+      </w:r>
+      <w:r>
+        <w:t>chamado hidrogênio azul</w:t>
+      </w:r>
+      <w:r>
+        <w:t>,</w:t>
+      </w:r>
+      <w:r>
+        <w:t xml:space="preserve"> podem superar aquelas provenientes da combustão direta do combustível original [@rezaei_2022].</w:t>
+      </w:r>
+      <w:r>
+        <w:t xml:space="preserve"> </w:t>
+      </w:r>
+      <w:r>
+        <w:rPr>
+          <w:color w:val="EE0000"/>
+        </w:rPr>
+        <w:t>Com base em @fan_2022, na figura \@ref(fig:emissao) são apresentadas estimativas de emissão de CO₂ por matéria-prima utilizada para a produção.</w:t>
+      </w:r>
+    </w:p>
+    <w:p>
+      <w:pPr>
+        <w:jc w:val="both"/>
+        <w:rPr>
+          <w:color w:val="EE0000"/>
+        </w:rPr>
+      </w:pPr>
+      <w:r>
+        <w:rPr>
+          <w:color w:val="EE0000"/>
+        </w:rPr>
+        <w:t>Em números</w:t>
+      </w:r>
+      <w:r>
+        <w:rPr>
+          <w:color w:val="EE0000"/>
+        </w:rPr>
+        <w:t>,</w:t>
+      </w:r>
+      <w:r>
+        <w:rPr>
+          <w:color w:val="EE0000"/>
+        </w:rPr>
+        <w:t xml:space="preserve"> e</w:t>
+      </w:r>
+      <w:r>
+        <w:rPr>
+          <w:color w:val="EE0000"/>
+        </w:rPr>
+        <w:t>stima-se que</w:t>
+      </w:r>
+      <w:r>
+        <w:rPr>
+          <w:color w:val="EE0000"/>
+        </w:rPr>
+        <w:t xml:space="preserve"> da</w:t>
+      </w:r>
+      <w:r>
+        <w:rPr>
+          <w:color w:val="EE0000"/>
+        </w:rPr>
+        <w:t xml:space="preserve"> produção anual </w:t>
+      </w:r>
+      <w:r>
+        <w:rPr>
+          <w:color w:val="EE0000"/>
+        </w:rPr>
+        <w:t xml:space="preserve">de hidrogênio, </w:t>
+      </w:r>
+      <w:r>
+        <w:rPr>
+          <w:color w:val="EE0000"/>
+        </w:rPr>
+        <w:t xml:space="preserve">situada entre </w:t>
+      </w:r>
+      <w:r>
+        <w:rPr>
+          <w:b/>
+          <w:bCs/>
+          <w:color w:val="EE0000"/>
+        </w:rPr>
+        <w:t>70 e 73 milhões de toneladas</w:t>
+      </w:r>
+      <w:r>
+        <w:rPr>
+          <w:color w:val="EE0000"/>
+        </w:rPr>
+        <w:t xml:space="preserve">, </w:t>
+      </w:r>
+      <w:r>
+        <w:rPr>
+          <w:b/>
+          <w:bCs/>
+          <w:color w:val="EE0000"/>
+        </w:rPr>
+        <w:t>75%</w:t>
+      </w:r>
+      <w:r>
+        <w:rPr>
+          <w:color w:val="EE0000"/>
+        </w:rPr>
+        <w:t xml:space="preserve"> </w:t>
+      </w:r>
+      <w:r>
+        <w:rPr>
+          <w:color w:val="EE0000"/>
+        </w:rPr>
+        <w:t xml:space="preserve">estejam </w:t>
+      </w:r>
+      <w:r>
+        <w:rPr>
+          <w:color w:val="EE0000"/>
+        </w:rPr>
+        <w:t xml:space="preserve">associadas ao gás natural e aproximadamente </w:t>
+      </w:r>
+      <w:r>
+        <w:rPr>
+          <w:b/>
+          <w:bCs/>
+          <w:color w:val="EE0000"/>
+        </w:rPr>
+        <w:t>23%</w:t>
+      </w:r>
+      <w:r>
+        <w:rPr>
+          <w:color w:val="EE0000"/>
+        </w:rPr>
+        <w:t xml:space="preserve"> relacionadas ao carvão, </w:t>
+      </w:r>
+      <w:r>
+        <w:rPr>
+          <w:color w:val="EE0000"/>
+        </w:rPr>
+        <w:t>resultando</w:t>
+      </w:r>
+      <w:r>
+        <w:rPr>
+          <w:color w:val="EE0000"/>
+        </w:rPr>
+        <w:t xml:space="preserve"> em emissões anuais da ordem de </w:t>
+      </w:r>
+      <w:r>
+        <w:rPr>
+          <w:b/>
+          <w:bCs/>
+          <w:color w:val="EE0000"/>
+        </w:rPr>
+        <w:t>830 milhões de toneladas de CO₂</w:t>
+      </w:r>
+      <w:r>
+        <w:rPr>
+          <w:b/>
+          <w:bCs/>
+          <w:color w:val="EE0000"/>
+        </w:rPr>
+        <w:t xml:space="preserve"> </w:t>
+      </w:r>
+      <w:r>
+        <w:rPr>
+          <w:color w:val="EE0000"/>
+        </w:rPr>
+        <w:t>[@hurtubia_2021;</w:t>
+      </w:r>
+      <w:r>
+        <w:rPr>
+          <w:color w:val="EE0000"/>
+        </w:rPr>
+        <w:t xml:space="preserve"> </w:t>
+      </w:r>
+      <w:r>
+        <w:rPr>
+          <w:color w:val="EE0000"/>
+        </w:rPr>
+        <w:t>@correa_2022; @tebibel_2021]</w:t>
+      </w:r>
+      <w:r>
+        <w:rPr>
+          <w:color w:val="EE0000"/>
+        </w:rPr>
+        <w:t xml:space="preserve">. </w:t>
+      </w:r>
+    </w:p>
+    <w:p>
+      <w:pPr>
+        <w:jc w:val="both"/>
+        <w:rPr>
+          <w:color w:val="EE0000"/>
+        </w:rPr>
+      </w:pPr>
+      <w:r>
+        <w:rPr>
+          <w:color w:val="EE0000"/>
+        </w:rPr>
+        <w:t xml:space="preserve">De outro lado, </w:t>
+      </w:r>
+      <w:r>
+        <w:rPr>
+          <w:color w:val="EE0000"/>
+        </w:rPr>
+        <w:t xml:space="preserve">apenas cerca de </w:t>
+      </w:r>
+      <w:r>
+        <w:rPr>
+          <w:b/>
+          <w:bCs/>
+          <w:color w:val="EE0000"/>
+        </w:rPr>
+        <w:t>2%</w:t>
+      </w:r>
+      <w:r>
+        <w:rPr>
+          <w:color w:val="EE0000"/>
+        </w:rPr>
+        <w:t xml:space="preserve"> </w:t>
+      </w:r>
+      <w:r>
+        <w:rPr>
+          <w:color w:val="EE0000"/>
+        </w:rPr>
+        <w:t xml:space="preserve">da produção de hidrogênio </w:t>
+      </w:r>
+      <w:r>
+        <w:rPr>
+          <w:color w:val="EE0000"/>
+        </w:rPr>
+        <w:t>decorrem da eletrólise da água</w:t>
+      </w:r>
+      <w:r>
+        <w:rPr>
+          <w:color w:val="EE0000"/>
+        </w:rPr>
+        <w:t xml:space="preserve"> e a </w:t>
+      </w:r>
+      <w:r>
+        <w:rPr>
+          <w:color w:val="EE0000"/>
+        </w:rPr>
+        <w:t xml:space="preserve">predominância das rotas fósseis impõe um obstáculo relevante à neutralidade climática do hidrogênio, </w:t>
+      </w:r>
+      <w:r>
+        <w:rPr>
+          <w:color w:val="EE0000"/>
+        </w:rPr>
+        <w:t>tornando-se</w:t>
+      </w:r>
+      <w:r>
+        <w:rPr>
+          <w:color w:val="EE0000"/>
+        </w:rPr>
+        <w:t xml:space="preserve"> evidente que a efetiva contribuição </w:t>
+      </w:r>
+      <w:r>
+        <w:rPr>
+          <w:color w:val="EE0000"/>
+        </w:rPr>
+        <w:t>deste elemento</w:t>
+      </w:r>
+      <w:r>
+        <w:rPr>
+          <w:color w:val="EE0000"/>
+        </w:rPr>
+        <w:t xml:space="preserve"> para a </w:t>
+      </w:r>
+      <w:r>
+        <w:rPr>
+          <w:color w:val="EE0000"/>
+        </w:rPr>
+        <w:t xml:space="preserve">transição energética dependa em grande medida </w:t>
+      </w:r>
+      <w:r>
+        <w:rPr>
+          <w:color w:val="EE0000"/>
+        </w:rPr>
+        <w:t>da transformação das rotas produtivas</w:t>
+      </w:r>
+      <w:r>
+        <w:rPr>
+          <w:color w:val="EE0000"/>
+        </w:rPr>
+        <w:t xml:space="preserve"> </w:t>
+      </w:r>
+      <w:r>
+        <w:rPr>
+          <w:color w:val="EE0000"/>
+        </w:rPr>
+        <w:t xml:space="preserve">atuais </w:t>
+      </w:r>
+      <w:r>
+        <w:rPr>
+          <w:color w:val="EE0000"/>
+        </w:rPr>
+        <w:t xml:space="preserve">na direção do uso de fontes renováveis limpas das quais </w:t>
+      </w:r>
+      <w:r>
+        <w:rPr>
+          <w:color w:val="EE0000"/>
+        </w:rPr>
+        <w:t xml:space="preserve">se destacam biomassa, </w:t>
+      </w:r>
+      <w:r>
+        <w:rPr>
+          <w:color w:val="EE0000"/>
+        </w:rPr>
+        <w:t>geotérmi</w:t>
+      </w:r>
+      <w:r>
+        <w:rPr>
+          <w:color w:val="EE0000"/>
+        </w:rPr>
+        <w:t>c</w:t>
+      </w:r>
+      <w:r>
+        <w:rPr>
+          <w:color w:val="EE0000"/>
+        </w:rPr>
+        <w:t>a</w:t>
+      </w:r>
+      <w:r>
+        <w:rPr>
+          <w:color w:val="EE0000"/>
+        </w:rPr>
+        <w:t>, hidrelétricas, energia solar e eólica [@tebibel_2021].</w:t>
+      </w:r>
+    </w:p>
+    <w:p>
+      <w:pPr>
+        <w:jc w:val="both"/>
+      </w:pPr>
+    </w:p>
+    <w:p>
+      <w:pPr>
+        <w:jc w:val="both"/>
+      </w:pPr>
+      <w:r>
+        <w:t>###############</w:t>
+      </w:r>
+    </w:p>
+    <w:p>
+      <w:pPr>
+        <w:jc w:val="both"/>
+      </w:pPr>
+    </w:p>
+    <w:p>
+      <w:pPr>
+        <w:jc w:val="both"/>
+      </w:pPr>
+    </w:p>
+    <w:p>
+      <w:pPr>
+        <w:jc w:val="both"/>
+      </w:pPr>
+    </w:p>
+    <w:p>
+      <w:pPr>
+        <w:jc w:val="both"/>
+      </w:pPr>
+    </w:p>
+    <w:p>
+      <w:pPr>
+        <w:jc w:val="both"/>
+      </w:pPr>
+      <w:r>
         <w:t xml:space="preserve">Sobre esse último aspecto, relacionado à sinergia entre a utilização de fontes renováveis de energia e a produção de hidrogênio para o equilíbrio entre oferta e demanda de eletricidade, é possível contextualizar as rotas de produção de hidrogênio. Conforme descrito por @rezaei_2022, para se obter o hidrogênio a partir da decomposição, existe uma variedade de tecnologias, envolvendo processos eletrolíticos, </w:t>
       </w:r>
       <w:proofErr w:type="spellStart"/>
@@ -136,92 +951,92 @@
         <w:jc w:val="both"/>
       </w:pPr>
       <w:r>
+        <w:t xml:space="preserve">Atualmente, a maior parte do hidrogênio produzido é obtida por meio de combustíveis fósseis, como hidrocarbonetos e carvão. Estudos indicam que algo entre 95% e 98% da produção de hidrogênio envolve o consumo de combustíveis fósseis, sendo cerca de 75% proveniente da reforma de gás natural e entre 20% e 23% da gaseificação de carvão, representando aproximadamente 83 milhões de toneladas de CO₂ emitidos. Nesses casos, mesmo que a captura e o armazenamento de CO₂ sejam tecnicamente viáveis com a finalidade de minimizar as emissões decorrentes da produção de hidrogênio, estas podem ser superiores às da simples queima de combustíveis fósseis, ainda que o uso posterior do hidrogênio seja limpo </w:t>
+      </w:r>
+      <w:r>
+        <w:rPr>
+          <w:highlight w:val="yellow"/>
+        </w:rPr>
+        <w:t xml:space="preserve">(sendo que, isto </w:t>
+      </w:r>
+      <w:proofErr w:type="gramStart"/>
+      <w:r>
+        <w:rPr>
+          <w:highlight w:val="yellow"/>
+        </w:rPr>
+        <w:t>ocorre pois</w:t>
+      </w:r>
+      <w:proofErr w:type="gramEnd"/>
+      <w:r>
+        <w:rPr>
+          <w:highlight w:val="yellow"/>
+        </w:rPr>
+        <w:t xml:space="preserve"> as tecnologias de captura e armazenamento de carbono não o total</w:t>
+      </w:r>
+      <w:r>
+        <w:t xml:space="preserve"> </w:t>
+      </w:r>
+      <w:r>
+        <w:t xml:space="preserve">[@hurtubia_2021; @correa_2022; @rezaei_2022]. </w:t>
+      </w:r>
+    </w:p>
+    <w:p>
+      <w:pPr>
+        <w:jc w:val="both"/>
+      </w:pPr>
+      <w:r>
+        <w:t>Com base em @fan_2022, na figura são apresentadas estimativas de emissão de CO₂ por matéria-prima utilizada para a produção.</w:t>
+      </w:r>
+    </w:p>
+    <w:p>
+      <w:pPr>
+        <w:jc w:val="both"/>
+      </w:pPr>
+      <w:r>
+        <w:rPr>
+          <w:highlight w:val="yellow"/>
+        </w:rPr>
+        <w:t>Em associação, a implementação de técnicas de captura e armazenamento de carbono</w:t>
+      </w:r>
+    </w:p>
+    <w:p>
+      <w:pPr>
+        <w:jc w:val="both"/>
+      </w:pPr>
+      <w:r>
+        <w:t>## Estrutura da Apostila</w:t>
+      </w:r>
+    </w:p>
+    <w:p>
+      <w:pPr>
+        <w:jc w:val="both"/>
+      </w:pPr>
+      <w:r>
+        <w:t xml:space="preserve">Este material é composto por quatro capítulos, além desta introdução. Enquanto a primeira seção do Capítulo 1 dedica-se à contextualização da economia do hidrogênio no cenário </w:t>
+      </w:r>
+      <w:proofErr w:type="gramStart"/>
+      <w:r>
+        <w:t>global ,abordando</w:t>
+      </w:r>
+      <w:proofErr w:type="gramEnd"/>
+      <w:r>
+        <w:t xml:space="preserve"> as motivações econômicas, ambientais e estratégicas, esta segunda seção tem por objetivo apresentar ao leitor a estrutura do documento, bem como esclarecer a lógica pedagógica adotada ao longo dos capítulos, em especial no que se refere ao uso de marcadores de destaque.</w:t>
+      </w:r>
+    </w:p>
+    <w:p>
+      <w:pPr>
+        <w:jc w:val="both"/>
+      </w:pPr>
+      <w:r>
+        <w:t xml:space="preserve">O Capítulo 2 é dedicado à apresentação dos princípios básicos de finanças, que constituem o arcabouço conceitual necessário para a análise de viabilidade financeira de projetos de produção de hidrogênio verde. Esses princípios são fundamentais, pois fornecem o vocabulário e a lógica econômica que sustentam as técnicas de avaliação financeira empregadas em projetos de engenharia. </w:t>
+      </w:r>
+    </w:p>
+    <w:p>
+      <w:pPr>
+        <w:jc w:val="both"/>
+      </w:pPr>
+      <w:r>
         <w:lastRenderedPageBreak/>
-        <w:t xml:space="preserve">Atualmente, a maior parte do hidrogênio produzido é obtida por meio de combustíveis fósseis, como hidrocarbonetos e carvão. Estudos indicam que algo entre 95% e 98% da produção de hidrogênio envolve o consumo de combustíveis fósseis, sendo cerca de 75% proveniente da reforma de gás natural e entre 20% e 23% da gaseificação de carvão, representando aproximadamente 83 milhões de toneladas de CO₂ emitidos. Nesses casos, mesmo que a captura e o armazenamento de CO₂ sejam tecnicamente viáveis com a finalidade de minimizar as emissões decorrentes da produção de hidrogênio, estas podem ser superiores às da simples queima de combustíveis fósseis, ainda que o uso posterior do hidrogênio seja limpo </w:t>
-      </w:r>
-      <w:r>
-        <w:rPr>
-          <w:highlight w:val="yellow"/>
-        </w:rPr>
-        <w:t xml:space="preserve">(sendo que, isto </w:t>
-      </w:r>
-      <w:proofErr w:type="gramStart"/>
-      <w:r>
-        <w:rPr>
-          <w:highlight w:val="yellow"/>
-        </w:rPr>
-        <w:t>ocorre pois</w:t>
-      </w:r>
-      <w:proofErr w:type="gramEnd"/>
-      <w:r>
-        <w:rPr>
-          <w:highlight w:val="yellow"/>
-        </w:rPr>
-        <w:t xml:space="preserve"> as tecnologias de captura e armazenamento de carbono não o total</w:t>
-      </w:r>
-      <w:r>
-        <w:t xml:space="preserve"> </w:t>
-      </w:r>
-      <w:r>
-        <w:t xml:space="preserve">[@hurtubia_2021; @correa_2022; @rezaei_2022]. </w:t>
-      </w:r>
-    </w:p>
-    <w:p>
-      <w:pPr>
-        <w:jc w:val="both"/>
-      </w:pPr>
-      <w:r>
-        <w:t>Com base em @fan_2022, na figura são apresentadas estimativas de emissão de CO₂ por matéria-prima utilizada para a produção.</w:t>
-      </w:r>
-    </w:p>
-    <w:p>
-      <w:pPr>
-        <w:jc w:val="both"/>
-      </w:pPr>
-      <w:r>
-        <w:rPr>
-          <w:highlight w:val="yellow"/>
-        </w:rPr>
-        <w:t>Em associação, a implementação de técnicas de captura e armazenamento de carbono</w:t>
-      </w:r>
-    </w:p>
-    <w:p>
-      <w:pPr>
-        <w:jc w:val="both"/>
-      </w:pPr>
-      <w:r>
-        <w:t>## Estrutura da Apostila</w:t>
-      </w:r>
-    </w:p>
-    <w:p>
-      <w:pPr>
-        <w:jc w:val="both"/>
-      </w:pPr>
-      <w:r>
-        <w:t xml:space="preserve">Este material é composto por quatro capítulos, além desta introdução. Enquanto a primeira seção do Capítulo 1 dedica-se à contextualização da economia do hidrogênio no cenário </w:t>
-      </w:r>
-      <w:proofErr w:type="gramStart"/>
-      <w:r>
-        <w:t>global ,abordando</w:t>
-      </w:r>
-      <w:proofErr w:type="gramEnd"/>
-      <w:r>
-        <w:t xml:space="preserve"> as motivações econômicas, ambientais e estratégicas, esta segunda seção tem por objetivo apresentar ao leitor a estrutura do documento, bem como esclarecer a lógica pedagógica adotada ao longo dos capítulos, em especial no que se refere ao uso de marcadores de destaque.</w:t>
-      </w:r>
-    </w:p>
-    <w:p>
-      <w:pPr>
-        <w:jc w:val="both"/>
-      </w:pPr>
-      <w:r>
-        <w:t xml:space="preserve">O Capítulo 2 é dedicado à apresentação dos princípios básicos de finanças, que constituem o arcabouço conceitual necessário para a análise de viabilidade financeira de projetos de produção de hidrogênio verde. Esses princípios são fundamentais, pois fornecem o vocabulário e a lógica econômica que sustentam as técnicas de avaliação financeira empregadas em projetos de engenharia. </w:t>
-      </w:r>
-    </w:p>
-    <w:p>
-      <w:pPr>
-        <w:jc w:val="both"/>
-      </w:pPr>
-      <w:r>
         <w:t>Cumpre ressaltar que este capítulo não possui a pretensão de esgotar os temas da análise de viabilidade financeira, tampouco de aprofundar exaustivamente cada tópico apresentado. O objetivo é, antes, introduzir os conceitos amplamente utilizados na literatura e na prática profissional, servindo como uma base conceitual sólida para os capítulos subsequentes.</w:t>
       </w:r>
     </w:p>
@@ -230,11 +1045,7 @@
         <w:jc w:val="both"/>
       </w:pPr>
       <w:r>
-        <w:t xml:space="preserve">Espera-se que, ao final do Capítulo 2, o leitor esteja familiarizado com o vocabulário essencial de finanças, sendo inclusive recomendada a construção de um dicionário próprio de conceitos, a fim de consolidar o aprendizado e facilitar consultas futuras. Com o intuito de tornar a leitura mais clara e orientada, esse </w:t>
-      </w:r>
-      <w:r>
-        <w:lastRenderedPageBreak/>
-        <w:t>capítulo utiliza marcadores específicos para destacar conteúdos relevantes. A interpretação desses marcadores deve seguir a lógica descrita a seguir.</w:t>
+        <w:t>Espera-se que, ao final do Capítulo 2, o leitor esteja familiarizado com o vocabulário essencial de finanças, sendo inclusive recomendada a construção de um dicionário próprio de conceitos, a fim de consolidar o aprendizado e facilitar consultas futuras. Com o intuito de tornar a leitura mais clara e orientada, esse capítulo utiliza marcadores específicos para destacar conteúdos relevantes. A interpretação desses marcadores deve seguir a lógica descrita a seguir.</w:t>
       </w:r>
     </w:p>
     <w:p>
@@ -404,19 +1215,19 @@
         <w:jc w:val="both"/>
       </w:pPr>
       <w:r>
-        <w:t>A partir dos conceitos de finanças apresentados no Capítulo 2 e de suas respectivas associações com projetos de hidrogênio, o Capítulo 3 tem como objetivo apresentar um panorama atual do estado da arte do mercado de hidrogênio. Esse panorama é construído sob duas perspectivas complementares: a da demanda, relacionada aos principais usos do hidrogênio, e a da oferta, associada às diferentes rotas tecnológicas de produção, com ênfase no hidrogênio de baixo carbono.</w:t>
-      </w:r>
-    </w:p>
-    <w:p>
-      <w:pPr>
-        <w:jc w:val="both"/>
-      </w:pPr>
-      <w:r>
-        <w:t xml:space="preserve">Por fim, o Capítulo 4 é dedicado à apresentação de estudos de caso de avaliação de viabilidade financeira, utilizando os parâmetros e conceitos discutidos nos capítulos anteriores. É importante destacar que esses estudos de caso possuem caráter didático e simplificado e não devem ser utilizados diretamente como suporte à tomada de decisão em projetos reais. Seu objetivo é orientar o leitor quanto à estrutura lógica de uma avaliação de viabilidade financeira, servindo como referência inicial para análises mais completas e detalhadas. Nesse capítulo, </w:t>
+        <w:t xml:space="preserve">A partir dos conceitos de finanças apresentados no Capítulo 2 e de suas respectivas associações com projetos de hidrogênio, o Capítulo 3 tem como objetivo apresentar um panorama atual do estado da arte do mercado de hidrogênio. Esse panorama é construído sob duas perspectivas complementares: a da demanda, relacionada aos principais usos do hidrogênio, e a da oferta, </w:t>
       </w:r>
       <w:r>
         <w:lastRenderedPageBreak/>
-        <w:t>também são introduzidos aspectos práticos de implementação computacional, com destaque para o uso de planilhas eletrônicas (Excel) como ferramenta de apoio à análise.</w:t>
+        <w:t>associada às diferentes rotas tecnológicas de produção, com ênfase no hidrogênio de baixo carbono.</w:t>
+      </w:r>
+    </w:p>
+    <w:p>
+      <w:pPr>
+        <w:jc w:val="both"/>
+      </w:pPr>
+      <w:r>
+        <w:t>Por fim, o Capítulo 4 é dedicado à apresentação de estudos de caso de avaliação de viabilidade financeira, utilizando os parâmetros e conceitos discutidos nos capítulos anteriores. É importante destacar que esses estudos de caso possuem caráter didático e simplificado e não devem ser utilizados diretamente como suporte à tomada de decisão em projetos reais. Seu objetivo é orientar o leitor quanto à estrutura lógica de uma avaliação de viabilidade financeira, servindo como referência inicial para análises mais completas e detalhadas. Nesse capítulo, também são introduzidos aspectos práticos de implementação computacional, com destaque para o uso de planilhas eletrônicas (Excel) como ferramenta de apoio à análise.</w:t>
       </w:r>
     </w:p>
     <w:p>
@@ -472,7 +1283,11 @@
         <w:jc w:val="both"/>
       </w:pPr>
       <w:r>
-        <w:t>Em virtude dessa interação necessária entre decisões de natureza técnica e financeira, consolidou-se na literatura o conceito de engenharia econômica, entendido como o campo do conhecimento dedicado à aplicação sistemática de técnicas de análise financeira à avaliação de projetos de engenharia.</w:t>
+        <w:t xml:space="preserve">Em virtude dessa interação necessária entre decisões de natureza técnica e financeira, consolidou-se na literatura o conceito de engenharia econômica, </w:t>
+      </w:r>
+      <w:r>
+        <w:lastRenderedPageBreak/>
+        <w:t>entendido como o campo do conhecimento dedicado à aplicação sistemática de técnicas de análise financeira à avaliação de projetos de engenharia.</w:t>
       </w:r>
     </w:p>
     <w:p>
@@ -488,84 +1303,87 @@
         <w:jc w:val="both"/>
       </w:pPr>
       <w:r>
+        <w:t xml:space="preserve">Nesse contexto, o presente capítulo tem por finalidade introduzir de forma sistemática os fundamentos conceituais da análise de viabilidade financeira de projetos de engenharia, apresentando os principais instrumentos utilizados no processo de avaliação financeira de investimentos de projetos de engenharia. </w:t>
+      </w:r>
+    </w:p>
+    <w:p>
+      <w:pPr>
+        <w:jc w:val="both"/>
+      </w:pPr>
+    </w:p>
+    <w:p>
+      <w:pPr>
+        <w:jc w:val="both"/>
+      </w:pPr>
+      <w:r>
+        <w:t>Por se tratar de uma apostila de caráter aplicado, os conceitos apresentados ao longo deste capítulo na medida do possível serão associados a projetos de produção de hidrogênio de baixo carbono, com ênfase em sistemas baseados na eletrólise da água. Espera-se que, ao término deste capítulo, o leitor esteja capacitado a compreender e aplicar, de forma estruturada e tecnicamente consistente, os conceitos fundamentais da análise de viabilidade financeira no contexto de projetos de produção de hidrogênio de baixo carbono.</w:t>
+      </w:r>
+    </w:p>
+    <w:p>
+      <w:pPr>
+        <w:jc w:val="both"/>
+      </w:pPr>
+      <w:r>
+        <w:t>## Os X Princípios Básicos</w:t>
+      </w:r>
+    </w:p>
+    <w:p>
+      <w:pPr>
+        <w:jc w:val="both"/>
+      </w:pPr>
+      <w:r>
+        <w:t>**Princípio 01 - O Dinheiro Muda de Valor ao Longo do Tempo**</w:t>
+      </w:r>
+    </w:p>
+    <w:p>
+      <w:pPr>
+        <w:jc w:val="both"/>
+      </w:pPr>
+      <w:r>
+        <w:t xml:space="preserve">A base conceitual da análise de viabilidade financeira de projetos fundamenta-se em um princípio elementar que orienta o conjunto de técnicas desenvolvidas neste capítulo: **o dinheiro muda de valor ao longo do tempo**. </w:t>
+      </w:r>
+    </w:p>
+    <w:p>
+      <w:pPr>
+        <w:jc w:val="both"/>
+      </w:pPr>
+      <w:r>
+        <w:t xml:space="preserve">Como consequência lógica imediata, tem-se que quantias monetárias expressas em diferentes </w:t>
+      </w:r>
+      <w:proofErr w:type="gramStart"/>
+      <w:r>
+        <w:t>períodos de tempo</w:t>
+      </w:r>
+      <w:proofErr w:type="gramEnd"/>
+      <w:r>
+        <w:t xml:space="preserve"> não são diretamente comparáveis. Para que tal comparação seja possível, torna-se necessário realizar um procedimento de correção do valor do dinheiro, de modo a expressar todas as quantias monetárias em uma mesma referência temporal.</w:t>
+      </w:r>
+    </w:p>
+    <w:p>
+      <w:pPr>
+        <w:jc w:val="both"/>
+      </w:pPr>
+      <w:r>
+        <w:t xml:space="preserve">Existem diversas razões que explicam por que uma unidade monetária não preserva seu valor ao longo do tempo. Uma das explicações mais recorrentes na literatura econômica é o fenômeno da inflação, compreendido como o aumento generalizado e persistente do nível de preços da economia. À medida que os preços de bens e serviços se elevam ao longo do tempo, o poder de compra associado a uma mesma unidade monetária se reduz. Essa perda de poder de compra constitui, </w:t>
+      </w:r>
+      <w:r>
         <w:lastRenderedPageBreak/>
-        <w:t xml:space="preserve">Nesse contexto, o presente capítulo tem por finalidade introduzir de forma sistemática os fundamentos conceituais da análise de viabilidade financeira de projetos de engenharia, apresentando os principais instrumentos utilizados no processo de avaliação financeira de investimentos de projetos de engenharia. </w:t>
-      </w:r>
-    </w:p>
-    <w:p>
-      <w:pPr>
-        <w:jc w:val="both"/>
-      </w:pPr>
-    </w:p>
-    <w:p>
-      <w:pPr>
-        <w:jc w:val="both"/>
-      </w:pPr>
-      <w:r>
-        <w:t>Por se tratar de uma apostila de caráter aplicado, os conceitos apresentados ao longo deste capítulo na medida do possível serão associados a projetos de produção de hidrogênio de baixo carbono, com ênfase em sistemas baseados na eletrólise da água. Espera-se que, ao término deste capítulo, o leitor esteja capacitado a compreender e aplicar, de forma estruturada e tecnicamente consistente, os conceitos fundamentais da análise de viabilidade financeira no contexto de projetos de produção de hidrogênio de baixo carbono.</w:t>
-      </w:r>
-    </w:p>
-    <w:p>
-      <w:pPr>
-        <w:jc w:val="both"/>
-      </w:pPr>
-      <w:r>
-        <w:t>## Os X Princípios Básicos</w:t>
-      </w:r>
-    </w:p>
-    <w:p>
-      <w:pPr>
-        <w:jc w:val="both"/>
-      </w:pPr>
-      <w:r>
-        <w:t>**Princípio 01 - O Dinheiro Muda de Valor ao Longo do Tempo**</w:t>
-      </w:r>
-    </w:p>
-    <w:p>
-      <w:pPr>
-        <w:jc w:val="both"/>
-      </w:pPr>
-      <w:r>
-        <w:t xml:space="preserve">A base conceitual da análise de viabilidade financeira de projetos fundamenta-se em um princípio elementar que orienta o conjunto de técnicas desenvolvidas neste capítulo: **o dinheiro muda de valor ao longo do tempo**. </w:t>
-      </w:r>
-    </w:p>
-    <w:p>
-      <w:pPr>
-        <w:jc w:val="both"/>
-      </w:pPr>
-      <w:r>
-        <w:t xml:space="preserve">Como consequência lógica imediata, tem-se que quantias monetárias expressas em diferentes </w:t>
+        <w:t>portanto, uma das formas pelas quais se manifesta a alteração do valor do dinheiro ao longo do tempo.</w:t>
+      </w:r>
+    </w:p>
+    <w:p>
+      <w:pPr>
+        <w:jc w:val="both"/>
+      </w:pPr>
+      <w:r>
+        <w:t xml:space="preserve">Cumpre ressaltar que, no contexto brasileiro, as taxas de inflação assumem relevância significativa. Na Figura \@ref(fig:ipca), são apresentadas as taxas anuais recentes de inflação, medidas pelo Índice de Preços ao Consumidor Amplo (IPCA), indicador que monitora a variação de preços de uma cesta de bens e serviços representativa do consumo das famílias brasileiras com renda mensal compreendida entre 1 e 40 </w:t>
       </w:r>
       <w:proofErr w:type="gramStart"/>
       <w:r>
-        <w:t>períodos de tempo</w:t>
+        <w:t>salários mínimos</w:t>
       </w:r>
       <w:proofErr w:type="gramEnd"/>
       <w:r>
-        <w:t xml:space="preserve"> não são diretamente comparáveis. Para que tal comparação seja possível, torna-se necessário realizar um procedimento de correção do valor do dinheiro, de modo a expressar todas as quantias monetárias em uma mesma referência temporal.</w:t>
-      </w:r>
-    </w:p>
-    <w:p>
-      <w:pPr>
-        <w:jc w:val="both"/>
-      </w:pPr>
-      <w:r>
-        <w:t>Existem diversas razões que explicam por que uma unidade monetária não preserva seu valor ao longo do tempo. Uma das explicações mais recorrentes na literatura econômica é o fenômeno da inflação, compreendido como o aumento generalizado e persistente do nível de preços da economia. À medida que os preços de bens e serviços se elevam ao longo do tempo, o poder de compra associado a uma mesma unidade monetária se reduz. Essa perda de poder de compra constitui, portanto, uma das formas pelas quais se manifesta a alteração do valor do dinheiro ao longo do tempo.</w:t>
-      </w:r>
-    </w:p>
-    <w:p>
-      <w:pPr>
-        <w:jc w:val="both"/>
-      </w:pPr>
-      <w:r>
-        <w:t xml:space="preserve">Cumpre ressaltar que, no contexto brasileiro, as taxas de inflação assumem relevância significativa. Na Figura \@ref(fig:ipca), são apresentadas as taxas anuais recentes de inflação, medidas pelo Índice de Preços ao Consumidor Amplo (IPCA), indicador que monitora a variação de preços de uma cesta de bens e serviços representativa do consumo das famílias brasileiras com renda mensal compreendida entre 1 e 40 </w:t>
-      </w:r>
-      <w:proofErr w:type="gramStart"/>
-      <w:r>
-        <w:t>salários mínimos</w:t>
-      </w:r>
-      <w:proofErr w:type="gramEnd"/>
-      <w:r>
         <w:t>.</w:t>
       </w:r>
     </w:p>
@@ -585,7 +1403,6 @@
         <w:jc w:val="both"/>
       </w:pPr>
       <w:r>
-        <w:lastRenderedPageBreak/>
         <w:t>A análise desse índice permite interpretar o quanto uma unidade monetária perdeu poder de compra de um período para outro, evidenciando, em números, a variação do valor do dinheiro ao longo do tempo.</w:t>
       </w:r>
     </w:p>
@@ -681,6 +1498,7 @@
         <w:rPr>
           <w:rFonts w:ascii="Segoe UI Emoji" w:hAnsi="Segoe UI Emoji" w:cs="Segoe UI Emoji"/>
         </w:rPr>
+        <w:lastRenderedPageBreak/>
         <w:t>⚠️</w:t>
       </w:r>
       <w:r>
@@ -749,7 +1567,6 @@
         <w:jc w:val="both"/>
       </w:pPr>
       <w:r>
-        <w:lastRenderedPageBreak/>
         <w:t>Conceito associado à duração temporal do fluxo de caixa do empreendimento. Em projetos de engenharia, a vida útil do projeto é, em geral, definida a partir do período de operação do equipamento ou sistema considerado mais relevante para a atividade-fim do empreendimento.</w:t>
       </w:r>
     </w:p>
@@ -1426,7 +2243,6 @@
   <w:style w:type="character" w:default="1" w:styleId="Fontepargpadro">
     <w:name w:val="Default Paragraph Font"/>
     <w:uiPriority w:val="1"/>
-    <w:semiHidden/>
     <w:unhideWhenUsed/>
   </w:style>
   <w:style w:type="table" w:default="1" w:styleId="Tabelanormal">

</xml_diff>

<commit_message>
Atualização do capítulo 2
</commit_message>
<xml_diff>
--- a/docx/versao_word.docx
+++ b/docx/versao_word.docx
@@ -1189,13 +1189,7 @@
         <w:t>Por se tratar de uma apostila de caráter aplicado, os conceitos apresentados ao longo deste capítulo serão associados</w:t>
       </w:r>
       <w:r>
-        <w:t xml:space="preserve">, </w:t>
-      </w:r>
-      <w:r>
-        <w:t>na medida do possível</w:t>
-      </w:r>
-      <w:r>
-        <w:t xml:space="preserve">, </w:t>
+        <w:t xml:space="preserve">, na medida do possível, </w:t>
       </w:r>
       <w:r>
         <w:t xml:space="preserve">a projetos de produção de hidrogênio </w:t>
@@ -1259,10 +1253,7 @@
         <w:t xml:space="preserve"> não são diretamente comparáveis. Para que tal comparação seja possível, torna-se necessário realizar um procedimento de correção do valor do dinheiro, de modo a expressar todas as quantias monetárias em uma mesma referência temporal</w:t>
       </w:r>
       <w:r>
-        <w:t xml:space="preserve"> </w:t>
-      </w:r>
-      <w:r>
-        <w:t>[@</w:t>
+        <w:t xml:space="preserve"> [@</w:t>
       </w:r>
       <w:r>
         <w:t>assaf_2017</w:t>

</xml_diff>